<commit_message>
Ultima versione funzionante: parsing documenti, ricerca semantica, generazione Word, WebSocket, correzione bug barra caricamento
</commit_message>
<xml_diff>
--- a/progetto.docx
+++ b/progetto.docx
@@ -122,49 +122,7 @@
         <w:rPr>
           <w:lang w:val="it-IT"/>
         </w:rPr>
-        <w:t>Se è immagine o PDF: OCR automatico (</w:t>
-      </w:r>
-      <w:proofErr w:type="spellStart"/>
-      <w:r>
-        <w:rPr>
-          <w:lang w:val="it-IT"/>
-        </w:rPr>
-        <w:t>Tesseract</w:t>
-      </w:r>
-      <w:proofErr w:type="spellEnd"/>
-      <w:r>
-        <w:rPr>
-          <w:lang w:val="it-IT"/>
-        </w:rPr>
-        <w:t xml:space="preserve">, </w:t>
-      </w:r>
-      <w:proofErr w:type="spellStart"/>
-      <w:r>
-        <w:rPr>
-          <w:lang w:val="it-IT"/>
-        </w:rPr>
-        <w:t>EasyOCR</w:t>
-      </w:r>
-      <w:proofErr w:type="spellEnd"/>
-      <w:r>
-        <w:rPr>
-          <w:lang w:val="it-IT"/>
-        </w:rPr>
-        <w:t xml:space="preserve">, Google Vision API, AWS </w:t>
-      </w:r>
-      <w:proofErr w:type="spellStart"/>
-      <w:r>
-        <w:rPr>
-          <w:lang w:val="it-IT"/>
-        </w:rPr>
-        <w:t>Textract</w:t>
-      </w:r>
-      <w:proofErr w:type="spellEnd"/>
-      <w:r>
-        <w:rPr>
-          <w:lang w:val="it-IT"/>
-        </w:rPr>
-        <w:t>).</w:t>
+        <w:t>Se è immagine o PDF: OCR automatico (Tesseract, EasyOCR, Google Vision API, AWS Textract).</w:t>
       </w:r>
     </w:p>
     <w:p>
@@ -181,21 +139,7 @@
         <w:rPr>
           <w:lang w:val="it-IT"/>
         </w:rPr>
-        <w:t xml:space="preserve">Se è PDF testuale: </w:t>
-      </w:r>
-      <w:proofErr w:type="spellStart"/>
-      <w:r>
-        <w:rPr>
-          <w:lang w:val="it-IT"/>
-        </w:rPr>
-        <w:t>parsing</w:t>
-      </w:r>
-      <w:proofErr w:type="spellEnd"/>
-      <w:r>
-        <w:rPr>
-          <w:lang w:val="it-IT"/>
-        </w:rPr>
-        <w:t xml:space="preserve"> diretto.</w:t>
+        <w:t>Se è PDF testuale: parsing diretto.</w:t>
       </w:r>
     </w:p>
     <w:p>
@@ -301,21 +245,7 @@
         <w:rPr>
           <w:lang w:val="it-IT"/>
         </w:rPr>
-        <w:t xml:space="preserve">Inserimento dati in SQL Server, </w:t>
-      </w:r>
-      <w:proofErr w:type="spellStart"/>
-      <w:r>
-        <w:rPr>
-          <w:lang w:val="it-IT"/>
-        </w:rPr>
-        <w:t>PostgreSQL</w:t>
-      </w:r>
-      <w:proofErr w:type="spellEnd"/>
-      <w:r>
-        <w:rPr>
-          <w:lang w:val="it-IT"/>
-        </w:rPr>
-        <w:t>, MySQL, ecc.</w:t>
+        <w:t>Inserimento dati in SQL Server, PostgreSQL, MySQL, ecc.</w:t>
       </w:r>
     </w:p>
     <w:p>
@@ -444,50 +374,14 @@
         <w:rPr>
           <w:lang w:val="it-IT"/>
         </w:rPr>
-        <w:t xml:space="preserve">Da shell </w:t>
-      </w:r>
-      <w:proofErr w:type="spellStart"/>
-      <w:r>
-        <w:rPr>
-          <w:lang w:val="it-IT"/>
-        </w:rPr>
-        <w:t>kanciare</w:t>
-      </w:r>
-      <w:proofErr w:type="spellEnd"/>
-      <w:r>
-        <w:rPr>
-          <w:lang w:val="it-IT"/>
-        </w:rPr>
-        <w:t xml:space="preserve">: </w:t>
-      </w:r>
-      <w:r>
-        <w:rPr>
-          <w:lang w:val="it-IT"/>
-        </w:rPr>
-        <w:t xml:space="preserve">C:\Users\nslimani\Desktop\document_flow&gt; </w:t>
-      </w:r>
-      <w:proofErr w:type="spellStart"/>
-      <w:r>
-        <w:rPr>
-          <w:lang w:val="it-IT"/>
-        </w:rPr>
-        <w:t>uvicorn</w:t>
-      </w:r>
-      <w:proofErr w:type="spellEnd"/>
-      <w:r>
-        <w:rPr>
-          <w:lang w:val="it-IT"/>
-        </w:rPr>
-        <w:t xml:space="preserve"> </w:t>
-      </w:r>
-      <w:proofErr w:type="spellStart"/>
-      <w:r>
-        <w:rPr>
-          <w:lang w:val="it-IT"/>
-        </w:rPr>
-        <w:t>src.api_server:app</w:t>
-      </w:r>
-      <w:proofErr w:type="spellEnd"/>
+        <w:t xml:space="preserve">Da shell kanciare: </w:t>
+      </w:r>
+      <w:r>
+        <w:rPr>
+          <w:lang w:val="it-IT"/>
+        </w:rPr>
+        <w:t>C:\Users\nslimani\Desktop\document_flow&gt; uvicorn src.api_server:app</w:t>
+      </w:r>
     </w:p>
     <w:p>
       <w:pPr>
@@ -516,16 +410,8 @@
         <w:rPr>
           <w:lang w:val="it-IT"/>
         </w:rPr>
-        <w:t xml:space="preserve">, dove vengono inseriti i dati mappati da </w:t>
-      </w:r>
-      <w:proofErr w:type="gramStart"/>
-      <w:r>
-        <w:rPr>
-          <w:lang w:val="it-IT"/>
-        </w:rPr>
-        <w:t>GPT :</w:t>
-      </w:r>
-      <w:proofErr w:type="gramEnd"/>
+        <w:t>, dove vengono inseriti i dati mappati da GPT :</w:t>
+      </w:r>
     </w:p>
     <w:p>
       <w:pPr>
@@ -557,35 +443,7 @@
         <w:rPr>
           <w:lang w:val="en-US"/>
         </w:rPr>
-        <w:t xml:space="preserve">select * from </w:t>
-      </w:r>
-      <w:proofErr w:type="spellStart"/>
-      <w:r>
-        <w:rPr>
-          <w:lang w:val="en-US"/>
-        </w:rPr>
-        <w:t>document_fields</w:t>
-      </w:r>
-      <w:proofErr w:type="spellEnd"/>
-      <w:r>
-        <w:rPr>
-          <w:lang w:val="en-US"/>
-        </w:rPr>
-        <w:t xml:space="preserve"> WHERE </w:t>
-      </w:r>
-      <w:proofErr w:type="spellStart"/>
-      <w:r>
-        <w:rPr>
-          <w:lang w:val="en-US"/>
-        </w:rPr>
-        <w:t>document_id</w:t>
-      </w:r>
-      <w:proofErr w:type="spellEnd"/>
-      <w:r>
-        <w:rPr>
-          <w:lang w:val="en-US"/>
-        </w:rPr>
-        <w:t xml:space="preserve"> in (52)</w:t>
+        <w:t>select * from document_fields WHERE document_id in (52)</w:t>
       </w:r>
     </w:p>
     <w:p>
@@ -709,7 +567,6 @@
           <w:lang w:val="it-IT"/>
         </w:rPr>
       </w:pPr>
-      <w:proofErr w:type="spellStart"/>
       <w:r>
         <w:rPr>
           <w:b/>
@@ -719,7 +576,6 @@
         </w:rPr>
         <w:t>Backend</w:t>
       </w:r>
-      <w:proofErr w:type="spellEnd"/>
       <w:r>
         <w:rPr>
           <w:u w:val="single"/>
@@ -786,21 +642,12 @@
           <w:lang w:val="it-IT"/>
         </w:rPr>
       </w:pPr>
-      <w:proofErr w:type="spellStart"/>
-      <w:r>
-        <w:rPr>
-          <w:u w:val="single"/>
-          <w:lang w:val="it-IT"/>
-        </w:rPr>
-        <w:t>Tesseract</w:t>
-      </w:r>
-      <w:proofErr w:type="spellEnd"/>
-      <w:r>
-        <w:rPr>
-          <w:u w:val="single"/>
-          <w:lang w:val="it-IT"/>
-        </w:rPr>
-        <w:t xml:space="preserve"> → open source, gratis</w:t>
+      <w:r>
+        <w:rPr>
+          <w:u w:val="single"/>
+          <w:lang w:val="it-IT"/>
+        </w:rPr>
+        <w:t>Tesseract → open source, gratis</w:t>
       </w:r>
     </w:p>
     <w:p>
@@ -814,21 +661,12 @@
           <w:lang w:val="it-IT"/>
         </w:rPr>
       </w:pPr>
-      <w:proofErr w:type="spellStart"/>
-      <w:r>
-        <w:rPr>
-          <w:u w:val="single"/>
-          <w:lang w:val="it-IT"/>
-        </w:rPr>
-        <w:t>EasyOCR</w:t>
-      </w:r>
-      <w:proofErr w:type="spellEnd"/>
-      <w:r>
-        <w:rPr>
-          <w:u w:val="single"/>
-          <w:lang w:val="it-IT"/>
-        </w:rPr>
-        <w:t xml:space="preserve"> → migliore per più lingue</w:t>
+      <w:r>
+        <w:rPr>
+          <w:u w:val="single"/>
+          <w:lang w:val="it-IT"/>
+        </w:rPr>
+        <w:t>EasyOCR → migliore per più lingue</w:t>
       </w:r>
     </w:p>
     <w:p>
@@ -847,23 +685,7 @@
           <w:u w:val="single"/>
           <w:lang w:val="en-US"/>
         </w:rPr>
-        <w:t xml:space="preserve">API cloud: Google Vision, AWS </w:t>
-      </w:r>
-      <w:proofErr w:type="spellStart"/>
-      <w:r>
-        <w:rPr>
-          <w:u w:val="single"/>
-          <w:lang w:val="en-US"/>
-        </w:rPr>
-        <w:t>Textract</w:t>
-      </w:r>
-      <w:proofErr w:type="spellEnd"/>
-      <w:r>
-        <w:rPr>
-          <w:u w:val="single"/>
-          <w:lang w:val="en-US"/>
-        </w:rPr>
-        <w:t>, Azure Form Recognizer</w:t>
+        <w:t>API cloud: Google Vision, AWS Textract, Azure Form Recognizer</w:t>
       </w:r>
     </w:p>
     <w:p>
@@ -891,23 +713,7 @@
           <w:u w:val="single"/>
           <w:lang w:val="it-IT"/>
         </w:rPr>
-        <w:t xml:space="preserve">: SQL Server (aziendale) o </w:t>
-      </w:r>
-      <w:proofErr w:type="spellStart"/>
-      <w:r>
-        <w:rPr>
-          <w:u w:val="single"/>
-          <w:lang w:val="it-IT"/>
-        </w:rPr>
-        <w:t>PostgreSQL</w:t>
-      </w:r>
-      <w:proofErr w:type="spellEnd"/>
-      <w:r>
-        <w:rPr>
-          <w:u w:val="single"/>
-          <w:lang w:val="it-IT"/>
-        </w:rPr>
-        <w:t xml:space="preserve"> (open source / SaaS)</w:t>
+        <w:t>: SQL Server (aziendale) o PostgreSQL (open source / SaaS)</w:t>
       </w:r>
     </w:p>
     <w:p>
@@ -954,17 +760,8 @@
           <w:u w:val="single"/>
           <w:lang w:val="it-IT"/>
         </w:rPr>
-        <w:t xml:space="preserve">Python: </w:t>
-      </w:r>
-      <w:proofErr w:type="spellStart"/>
-      <w:r>
-        <w:rPr>
-          <w:u w:val="single"/>
-          <w:lang w:val="it-IT"/>
-        </w:rPr>
-        <w:t>watchdog</w:t>
-      </w:r>
-      <w:proofErr w:type="spellEnd"/>
+        <w:t>Python: watchdog</w:t>
+      </w:r>
     </w:p>
     <w:p>
       <w:pPr>
@@ -982,23 +779,7 @@
           <w:u w:val="single"/>
           <w:lang w:val="it-IT"/>
         </w:rPr>
-        <w:t xml:space="preserve">Windows: </w:t>
-      </w:r>
-      <w:proofErr w:type="spellStart"/>
-      <w:r>
-        <w:rPr>
-          <w:u w:val="single"/>
-          <w:lang w:val="it-IT"/>
-        </w:rPr>
-        <w:t>FileSystemWatcher</w:t>
-      </w:r>
-      <w:proofErr w:type="spellEnd"/>
-      <w:r>
-        <w:rPr>
-          <w:u w:val="single"/>
-          <w:lang w:val="it-IT"/>
-        </w:rPr>
-        <w:t xml:space="preserve"> in .NET</w:t>
+        <w:t>Windows: FileSystemWatcher in .NET</w:t>
       </w:r>
     </w:p>
     <w:p>
@@ -1082,17 +863,8 @@
           <w:u w:val="single"/>
           <w:lang w:val="it-IT"/>
         </w:rPr>
-        <w:t>Dati salvati in database multi-</w:t>
-      </w:r>
-      <w:proofErr w:type="spellStart"/>
-      <w:r>
-        <w:rPr>
-          <w:u w:val="single"/>
-          <w:lang w:val="it-IT"/>
-        </w:rPr>
-        <w:t>tenant</w:t>
-      </w:r>
-      <w:proofErr w:type="spellEnd"/>
+        <w:t>Dati salvati in database multi-tenant</w:t>
+      </w:r>
     </w:p>
     <w:p>
       <w:pPr>
@@ -1305,21 +1077,7 @@
         <w:rPr>
           <w:lang w:val="it-IT"/>
         </w:rPr>
-        <w:t>Mostrare un’anteprima PDF o immagine direttamente nella tabella/</w:t>
-      </w:r>
-      <w:proofErr w:type="spellStart"/>
-      <w:r>
-        <w:rPr>
-          <w:lang w:val="it-IT"/>
-        </w:rPr>
-        <w:t>modal</w:t>
-      </w:r>
-      <w:proofErr w:type="spellEnd"/>
-      <w:r>
-        <w:rPr>
-          <w:lang w:val="it-IT"/>
-        </w:rPr>
-        <w:t xml:space="preserve"> prima di scaricare il file Word.</w:t>
+        <w:t>Mostrare un’anteprima PDF o immagine direttamente nella tabella/modal prima di scaricare il file Word.</w:t>
       </w:r>
     </w:p>
     <w:p>
@@ -1350,7 +1108,7 @@
           <w:lang w:val="it-IT"/>
         </w:rPr>
         <w:pict w14:anchorId="0653A137">
-          <v:rect id="_x0000_i1062" style="width:0;height:1.5pt" o:hralign="center" o:hrstd="t" o:hr="t" fillcolor="#a0a0a0" stroked="f"/>
+          <v:rect id="_x0000_i1026" style="width:0;height:1.5pt" o:hralign="center" o:hrstd="t" o:hr="t" fillcolor="#a0a0a0" stroked="f"/>
         </w:pict>
       </w:r>
     </w:p>
@@ -1416,7 +1174,7 @@
           <w:lang w:val="it-IT"/>
         </w:rPr>
         <w:pict w14:anchorId="515C62B1">
-          <v:rect id="_x0000_i1063" style="width:0;height:1.5pt" o:hralign="center" o:hrstd="t" o:hr="t" fillcolor="#a0a0a0" stroked="f"/>
+          <v:rect id="_x0000_i1027" style="width:0;height:1.5pt" o:hralign="center" o:hrstd="t" o:hr="t" fillcolor="#a0a0a0" stroked="f"/>
         </w:pict>
       </w:r>
     </w:p>
@@ -1541,7 +1299,7 @@
           <w:lang w:val="it-IT"/>
         </w:rPr>
         <w:pict w14:anchorId="6043047A">
-          <v:rect id="_x0000_i1064" style="width:0;height:1.5pt" o:hralign="center" o:hrstd="t" o:hr="t" fillcolor="#a0a0a0" stroked="f"/>
+          <v:rect id="_x0000_i1028" style="width:0;height:1.5pt" o:hralign="center" o:hrstd="t" o:hr="t" fillcolor="#a0a0a0" stroked="f"/>
         </w:pict>
       </w:r>
     </w:p>
@@ -1647,7 +1405,7 @@
           <w:lang w:val="it-IT"/>
         </w:rPr>
         <w:pict w14:anchorId="060FB6E8">
-          <v:rect id="_x0000_i1065" style="width:0;height:1.5pt" o:hralign="center" o:hrstd="t" o:hr="t" fillcolor="#a0a0a0" stroked="f"/>
+          <v:rect id="_x0000_i1029" style="width:0;height:1.5pt" o:hralign="center" o:hrstd="t" o:hr="t" fillcolor="#a0a0a0" stroked="f"/>
         </w:pict>
       </w:r>
     </w:p>
@@ -1705,23 +1463,7 @@
           <w:color w:val="FF0000"/>
           <w:lang w:val="it-IT"/>
         </w:rPr>
-        <w:t xml:space="preserve">Possiamo fare un semplice login in </w:t>
-      </w:r>
-      <w:proofErr w:type="spellStart"/>
-      <w:r>
-        <w:rPr>
-          <w:color w:val="FF0000"/>
-          <w:lang w:val="it-IT"/>
-        </w:rPr>
-        <w:t>FastAPI</w:t>
-      </w:r>
-      <w:proofErr w:type="spellEnd"/>
-      <w:r>
-        <w:rPr>
-          <w:color w:val="FF0000"/>
-          <w:lang w:val="it-IT"/>
-        </w:rPr>
-        <w:t xml:space="preserve"> con sessioni o JWT.</w:t>
+        <w:t>Possiamo fare un semplice login in FastAPI con sessioni o JWT.</w:t>
       </w:r>
     </w:p>
     <w:p>
@@ -1735,7 +1477,7 @@
           <w:lang w:val="it-IT"/>
         </w:rPr>
         <w:pict w14:anchorId="23E89C0E">
-          <v:rect id="_x0000_i1066" style="width:0;height:1.5pt" o:hralign="center" o:hrstd="t" o:hr="t" fillcolor="#a0a0a0" stroked="f"/>
+          <v:rect id="_x0000_i1030" style="width:0;height:1.5pt" o:hralign="center" o:hrstd="t" o:hr="t" fillcolor="#a0a0a0" stroked="f"/>
         </w:pict>
       </w:r>
     </w:p>
@@ -1809,7 +1551,7 @@
           <w:lang w:val="it-IT"/>
         </w:rPr>
         <w:pict w14:anchorId="2DB77A49">
-          <v:rect id="_x0000_i1067" style="width:0;height:1.5pt" o:hralign="center" o:hrstd="t" o:hr="t" fillcolor="#a0a0a0" stroked="f"/>
+          <v:rect id="_x0000_i1031" style="width:0;height:1.5pt" o:hralign="center" o:hrstd="t" o:hr="t" fillcolor="#a0a0a0" stroked="f"/>
         </w:pict>
       </w:r>
     </w:p>
@@ -1829,19 +1571,8 @@
           <w:color w:val="FF0000"/>
           <w:lang w:val="it-IT"/>
         </w:rPr>
-        <w:t xml:space="preserve">7. Notifiche </w:t>
-      </w:r>
-      <w:proofErr w:type="spellStart"/>
-      <w:r>
-        <w:rPr>
-          <w:b/>
-          <w:bCs/>
-          <w:color w:val="FF0000"/>
-          <w:lang w:val="it-IT"/>
-        </w:rPr>
-        <w:t>realtime</w:t>
-      </w:r>
-      <w:proofErr w:type="spellEnd"/>
+        <w:t>7. Notifiche realtime</w:t>
+      </w:r>
     </w:p>
     <w:p>
       <w:pPr>
@@ -1880,7 +1611,6 @@
         </w:rPr>
         <w:t xml:space="preserve">Possibile con </w:t>
       </w:r>
-      <w:proofErr w:type="spellStart"/>
       <w:r>
         <w:rPr>
           <w:b/>
@@ -1890,23 +1620,217 @@
         </w:rPr>
         <w:t>WebSocket</w:t>
       </w:r>
-      <w:proofErr w:type="spellEnd"/>
-      <w:r>
-        <w:rPr>
-          <w:color w:val="FF0000"/>
-          <w:lang w:val="it-IT"/>
-        </w:rPr>
-        <w:t xml:space="preserve"> in </w:t>
-      </w:r>
-      <w:proofErr w:type="spellStart"/>
-      <w:r>
-        <w:rPr>
-          <w:color w:val="FF0000"/>
-          <w:lang w:val="it-IT"/>
-        </w:rPr>
-        <w:t>FastAPI</w:t>
-      </w:r>
-      <w:proofErr w:type="spellEnd"/>
+      <w:r>
+        <w:rPr>
+          <w:color w:val="FF0000"/>
+          <w:lang w:val="it-IT"/>
+        </w:rPr>
+        <w:t xml:space="preserve"> in FastAPI.</w:t>
+      </w:r>
+    </w:p>
+    <w:p>
+      <w:pPr>
+        <w:rPr>
+          <w:color w:val="FF0000"/>
+          <w:lang w:val="it-IT"/>
+        </w:rPr>
+      </w:pPr>
+    </w:p>
+    <w:p>
+      <w:pPr>
+        <w:rPr>
+          <w:b/>
+          <w:bCs/>
+          <w:color w:val="FF0000"/>
+          <w:lang w:val="it-IT"/>
+        </w:rPr>
+      </w:pPr>
+      <w:r>
+        <w:rPr>
+          <w:b/>
+          <w:bCs/>
+          <w:color w:val="FF0000"/>
+          <w:lang w:val="it-IT"/>
+        </w:rPr>
+        <w:t>4️</w:t>
+      </w:r>
+      <w:r>
+        <w:rPr>
+          <w:rFonts w:ascii="Segoe UI Symbol" w:hAnsi="Segoe UI Symbol" w:cs="Segoe UI Symbol"/>
+          <w:b/>
+          <w:bCs/>
+          <w:color w:val="FF0000"/>
+          <w:lang w:val="it-IT"/>
+        </w:rPr>
+        <w:t>⃣</w:t>
+      </w:r>
+      <w:r>
+        <w:rPr>
+          <w:b/>
+          <w:bCs/>
+          <w:color w:val="FF0000"/>
+          <w:lang w:val="it-IT"/>
+        </w:rPr>
+        <w:t xml:space="preserve"> Miglioramento molto utile (consigliato)</w:t>
+      </w:r>
+    </w:p>
+    <w:p>
+      <w:pPr>
+        <w:rPr>
+          <w:color w:val="FF0000"/>
+          <w:lang w:val="it-IT"/>
+        </w:rPr>
+      </w:pPr>
+      <w:r>
+        <w:rPr>
+          <w:color w:val="FF0000"/>
+          <w:lang w:val="it-IT"/>
+        </w:rPr>
+        <w:t>Possiamo anche aggiungere:</w:t>
+      </w:r>
+    </w:p>
+    <w:p>
+      <w:pPr>
+        <w:rPr>
+          <w:b/>
+          <w:bCs/>
+          <w:color w:val="FF0000"/>
+          <w:lang w:val="it-IT"/>
+        </w:rPr>
+      </w:pPr>
+      <w:r>
+        <w:rPr>
+          <w:rFonts w:ascii="Segoe UI Emoji" w:hAnsi="Segoe UI Emoji" w:cs="Segoe UI Emoji"/>
+          <w:b/>
+          <w:bCs/>
+          <w:color w:val="FF0000"/>
+          <w:lang w:val="it-IT"/>
+        </w:rPr>
+        <w:t>🔎</w:t>
+      </w:r>
+      <w:r>
+        <w:rPr>
+          <w:b/>
+          <w:bCs/>
+          <w:color w:val="FF0000"/>
+          <w:lang w:val="it-IT"/>
+        </w:rPr>
+        <w:t xml:space="preserve"> ricerca AI nei documenti</w:t>
+      </w:r>
+    </w:p>
+    <w:p>
+      <w:pPr>
+        <w:rPr>
+          <w:color w:val="FF0000"/>
+          <w:lang w:val="it-IT"/>
+        </w:rPr>
+      </w:pPr>
+      <w:r>
+        <w:rPr>
+          <w:color w:val="FF0000"/>
+          <w:lang w:val="it-IT"/>
+        </w:rPr>
+        <w:t>Esempio:</w:t>
+      </w:r>
+    </w:p>
+    <w:p>
+      <w:pPr>
+        <w:rPr>
+          <w:color w:val="FF0000"/>
+          <w:lang w:val="it-IT"/>
+        </w:rPr>
+      </w:pPr>
+      <w:r>
+        <w:rPr>
+          <w:color w:val="FF0000"/>
+          <w:lang w:val="it-IT"/>
+        </w:rPr>
+        <w:t>Cerca: nome = Mario</w:t>
+      </w:r>
+    </w:p>
+    <w:p>
+      <w:pPr>
+        <w:rPr>
+          <w:color w:val="FF0000"/>
+          <w:lang w:val="it-IT"/>
+        </w:rPr>
+      </w:pPr>
+      <w:r>
+        <w:rPr>
+          <w:color w:val="FF0000"/>
+          <w:lang w:val="it-IT"/>
+        </w:rPr>
+        <w:t>oppure</w:t>
+      </w:r>
+    </w:p>
+    <w:p>
+      <w:pPr>
+        <w:rPr>
+          <w:color w:val="FF0000"/>
+          <w:lang w:val="it-IT"/>
+        </w:rPr>
+      </w:pPr>
+      <w:r>
+        <w:rPr>
+          <w:color w:val="FF0000"/>
+          <w:lang w:val="it-IT"/>
+        </w:rPr>
+        <w:t>Trova passaporti italiani</w:t>
+      </w:r>
+    </w:p>
+    <w:p>
+      <w:pPr>
+        <w:rPr>
+          <w:color w:val="FF0000"/>
+          <w:lang w:val="it-IT"/>
+        </w:rPr>
+      </w:pPr>
+      <w:r>
+        <w:rPr>
+          <w:color w:val="FF0000"/>
+          <w:lang w:val="it-IT"/>
+        </w:rPr>
+        <w:t>oppure</w:t>
+      </w:r>
+    </w:p>
+    <w:p>
+      <w:pPr>
+        <w:rPr>
+          <w:color w:val="FF0000"/>
+          <w:lang w:val="it-IT"/>
+        </w:rPr>
+      </w:pPr>
+      <w:r>
+        <w:rPr>
+          <w:color w:val="FF0000"/>
+          <w:lang w:val="it-IT"/>
+        </w:rPr>
+        <w:t>documenti con data 2025</w:t>
+      </w:r>
+    </w:p>
+    <w:p>
+      <w:pPr>
+        <w:rPr>
+          <w:color w:val="FF0000"/>
+          <w:lang w:val="it-IT"/>
+        </w:rPr>
+      </w:pPr>
+      <w:r>
+        <w:rPr>
+          <w:color w:val="FF0000"/>
+          <w:lang w:val="it-IT"/>
+        </w:rPr>
+        <w:t xml:space="preserve">Questo trasforma il software in un </w:t>
+      </w:r>
+      <w:r>
+        <w:rPr>
+          <w:b/>
+          <w:bCs/>
+          <w:color w:val="FF0000"/>
+          <w:lang w:val="it-IT"/>
+        </w:rPr>
+        <w:t>Document AI intelligente</w:t>
+      </w:r>
       <w:r>
         <w:rPr>
           <w:color w:val="FF0000"/>
@@ -1922,58 +1846,14 @@
           <w:lang w:val="it-IT"/>
         </w:rPr>
       </w:pPr>
-    </w:p>
-    <w:p>
-      <w:pPr>
-        <w:rPr>
-          <w:b/>
-          <w:bCs/>
-          <w:color w:val="FF0000"/>
-          <w:lang w:val="it-IT"/>
-        </w:rPr>
-      </w:pPr>
-      <w:r>
-        <w:rPr>
-          <w:b/>
-          <w:bCs/>
-          <w:color w:val="FF0000"/>
-          <w:lang w:val="it-IT"/>
-        </w:rPr>
-        <w:t>4️</w:t>
-      </w:r>
-      <w:r>
-        <w:rPr>
-          <w:rFonts w:ascii="Segoe UI Symbol" w:hAnsi="Segoe UI Symbol" w:cs="Segoe UI Symbol"/>
-          <w:b/>
-          <w:bCs/>
-          <w:color w:val="FF0000"/>
-          <w:lang w:val="it-IT"/>
-        </w:rPr>
-        <w:t>⃣</w:t>
-      </w:r>
-      <w:r>
-        <w:rPr>
-          <w:b/>
-          <w:bCs/>
-          <w:color w:val="FF0000"/>
-          <w:lang w:val="it-IT"/>
-        </w:rPr>
-        <w:t xml:space="preserve"> Miglioramento molto utile (consigliato)</w:t>
-      </w:r>
-    </w:p>
-    <w:p>
-      <w:pPr>
-        <w:rPr>
-          <w:color w:val="FF0000"/>
-          <w:lang w:val="it-IT"/>
-        </w:rPr>
-      </w:pPr>
-      <w:r>
-        <w:rPr>
-          <w:color w:val="FF0000"/>
-          <w:lang w:val="it-IT"/>
-        </w:rPr>
-        <w:t>Possiamo anche aggiungere:</w:t>
+      <w:r>
+        <w:rPr>
+          <w:color w:val="FF0000"/>
+          <w:lang w:val="it-IT"/>
+        </w:rPr>
+        <w:pict w14:anchorId="204AA87D">
+          <v:rect id="_x0000_i1032" style="width:0;height:1.5pt" o:hralign="center" o:hrstd="t" o:hr="t" fillcolor="#a0a0a0" stroked="f"/>
+        </w:pict>
       </w:r>
     </w:p>
     <w:p>
@@ -1993,46 +1873,122 @@
           <w:color w:val="FF0000"/>
           <w:lang w:val="it-IT"/>
         </w:rPr>
-        <w:t>🔎</w:t>
-      </w:r>
-      <w:r>
-        <w:rPr>
-          <w:b/>
-          <w:bCs/>
-          <w:color w:val="FF0000"/>
-          <w:lang w:val="it-IT"/>
-        </w:rPr>
-        <w:t xml:space="preserve"> ricerca AI nei documenti</w:t>
-      </w:r>
-    </w:p>
-    <w:p>
-      <w:pPr>
-        <w:rPr>
-          <w:color w:val="FF0000"/>
-          <w:lang w:val="it-IT"/>
-        </w:rPr>
-      </w:pPr>
-      <w:r>
-        <w:rPr>
-          <w:color w:val="FF0000"/>
-          <w:lang w:val="it-IT"/>
-        </w:rPr>
-        <w:t>Esempio:</w:t>
-      </w:r>
-    </w:p>
-    <w:p>
-      <w:pPr>
-        <w:rPr>
-          <w:color w:val="FF0000"/>
-          <w:lang w:val="it-IT"/>
-        </w:rPr>
-      </w:pPr>
-      <w:r>
-        <w:rPr>
-          <w:color w:val="FF0000"/>
-          <w:lang w:val="it-IT"/>
-        </w:rPr>
-        <w:t>Cerca: nome = Mario</w:t>
+        <w:t>🚀</w:t>
+      </w:r>
+      <w:r>
+        <w:rPr>
+          <w:b/>
+          <w:bCs/>
+          <w:color w:val="FF0000"/>
+          <w:lang w:val="it-IT"/>
+        </w:rPr>
+        <w:t xml:space="preserve"> Se vuoi nel prossimo passo posso aggiungere</w:t>
+      </w:r>
+    </w:p>
+    <w:p>
+      <w:pPr>
+        <w:rPr>
+          <w:color w:val="FF0000"/>
+          <w:lang w:val="it-IT"/>
+        </w:rPr>
+      </w:pPr>
+      <w:r>
+        <w:rPr>
+          <w:color w:val="FF0000"/>
+          <w:lang w:val="it-IT"/>
+        </w:rPr>
+        <w:t xml:space="preserve">Una </w:t>
+      </w:r>
+      <w:r>
+        <w:rPr>
+          <w:b/>
+          <w:bCs/>
+          <w:color w:val="FF0000"/>
+          <w:lang w:val="it-IT"/>
+        </w:rPr>
+        <w:t>funzione molto potente</w:t>
+      </w:r>
+      <w:r>
+        <w:rPr>
+          <w:color w:val="FF0000"/>
+          <w:lang w:val="it-IT"/>
+        </w:rPr>
+        <w:t xml:space="preserve"> che renderebbe il tuo progetto </w:t>
+      </w:r>
+      <w:r>
+        <w:rPr>
+          <w:b/>
+          <w:bCs/>
+          <w:color w:val="FF0000"/>
+          <w:lang w:val="it-IT"/>
+        </w:rPr>
+        <w:t>vendibile alle aziende</w:t>
+      </w:r>
+      <w:r>
+        <w:rPr>
+          <w:color w:val="FF0000"/>
+          <w:lang w:val="it-IT"/>
+        </w:rPr>
+        <w:t>:</w:t>
+      </w:r>
+    </w:p>
+    <w:p>
+      <w:pPr>
+        <w:rPr>
+          <w:b/>
+          <w:bCs/>
+          <w:color w:val="FF0000"/>
+          <w:lang w:val="it-IT"/>
+        </w:rPr>
+      </w:pPr>
+      <w:r>
+        <w:rPr>
+          <w:rFonts w:ascii="Segoe UI Emoji" w:hAnsi="Segoe UI Emoji" w:cs="Segoe UI Emoji"/>
+          <w:b/>
+          <w:bCs/>
+          <w:color w:val="FF0000"/>
+          <w:lang w:val="it-IT"/>
+        </w:rPr>
+        <w:t>⭐</w:t>
+      </w:r>
+      <w:r>
+        <w:rPr>
+          <w:b/>
+          <w:bCs/>
+          <w:color w:val="FF0000"/>
+          <w:lang w:val="it-IT"/>
+        </w:rPr>
+        <w:t xml:space="preserve"> Ricerca nei documenti con AI</w:t>
+      </w:r>
+    </w:p>
+    <w:p>
+      <w:pPr>
+        <w:rPr>
+          <w:color w:val="FF0000"/>
+          <w:lang w:val="it-IT"/>
+        </w:rPr>
+      </w:pPr>
+      <w:r>
+        <w:rPr>
+          <w:color w:val="FF0000"/>
+          <w:lang w:val="it-IT"/>
+        </w:rPr>
+        <w:t>tipo:</w:t>
+      </w:r>
+    </w:p>
+    <w:p>
+      <w:pPr>
+        <w:rPr>
+          <w:color w:val="FF0000"/>
+          <w:lang w:val="it-IT"/>
+        </w:rPr>
+      </w:pPr>
+      <w:r>
+        <w:rPr>
+          <w:color w:val="FF0000"/>
+          <w:lang w:val="it-IT"/>
+        </w:rPr>
+        <w:t>Trova documenti con cognome Rossi</w:t>
       </w:r>
     </w:p>
     <w:p>
@@ -2062,7 +2018,7 @@
           <w:color w:val="FF0000"/>
           <w:lang w:val="it-IT"/>
         </w:rPr>
-        <w:t>Trova passaporti italiani</w:t>
+        <w:t>Trova passaporti francesi</w:t>
       </w:r>
     </w:p>
     <w:p>
@@ -2092,42 +2048,31 @@
           <w:color w:val="FF0000"/>
           <w:lang w:val="it-IT"/>
         </w:rPr>
-        <w:t>documenti con data 2025</w:t>
-      </w:r>
-    </w:p>
-    <w:p>
-      <w:pPr>
-        <w:rPr>
-          <w:color w:val="FF0000"/>
-          <w:lang w:val="it-IT"/>
-        </w:rPr>
-      </w:pPr>
-      <w:r>
-        <w:rPr>
-          <w:color w:val="FF0000"/>
-          <w:lang w:val="it-IT"/>
-        </w:rPr>
-        <w:t xml:space="preserve">Questo trasforma il software in un </w:t>
-      </w:r>
-      <w:proofErr w:type="spellStart"/>
-      <w:r>
-        <w:rPr>
-          <w:b/>
-          <w:bCs/>
-          <w:color w:val="FF0000"/>
-          <w:lang w:val="it-IT"/>
-        </w:rPr>
-        <w:t>Document</w:t>
-      </w:r>
-      <w:proofErr w:type="spellEnd"/>
-      <w:r>
-        <w:rPr>
-          <w:b/>
-          <w:bCs/>
-          <w:color w:val="FF0000"/>
-          <w:lang w:val="it-IT"/>
-        </w:rPr>
-        <w:t xml:space="preserve"> AI intelligente</w:t>
+        <w:t>Trova documenti con scadenza 2027</w:t>
+      </w:r>
+    </w:p>
+    <w:p>
+      <w:pPr>
+        <w:rPr>
+          <w:color w:val="FF0000"/>
+          <w:lang w:val="it-IT"/>
+        </w:rPr>
+      </w:pPr>
+      <w:r>
+        <w:rPr>
+          <w:color w:val="FF0000"/>
+          <w:lang w:val="it-IT"/>
+        </w:rPr>
+        <w:t xml:space="preserve">Questo è </w:t>
+      </w:r>
+      <w:r>
+        <w:rPr>
+          <w:b/>
+          <w:bCs/>
+          <w:color w:val="FF0000"/>
+          <w:lang w:val="it-IT"/>
+        </w:rPr>
+        <w:t>il tipo di funzione che vendono software da 10-50k €</w:t>
       </w:r>
       <w:r>
         <w:rPr>
@@ -2149,228 +2094,16 @@
           <w:color w:val="FF0000"/>
           <w:lang w:val="it-IT"/>
         </w:rPr>
-        <w:pict w14:anchorId="204AA87D">
-          <v:rect id="_x0000_i1082" style="width:0;height:1.5pt" o:hralign="center" o:hrstd="t" o:hr="t" fillcolor="#a0a0a0" stroked="f"/>
-        </w:pict>
-      </w:r>
-    </w:p>
-    <w:p>
-      <w:pPr>
-        <w:rPr>
-          <w:b/>
-          <w:bCs/>
-          <w:color w:val="FF0000"/>
-          <w:lang w:val="it-IT"/>
-        </w:rPr>
-      </w:pPr>
-      <w:r>
-        <w:rPr>
-          <w:rFonts w:ascii="Segoe UI Emoji" w:hAnsi="Segoe UI Emoji" w:cs="Segoe UI Emoji"/>
-          <w:b/>
-          <w:bCs/>
-          <w:color w:val="FF0000"/>
-          <w:lang w:val="it-IT"/>
-        </w:rPr>
-        <w:t>🚀</w:t>
-      </w:r>
-      <w:r>
-        <w:rPr>
-          <w:b/>
-          <w:bCs/>
-          <w:color w:val="FF0000"/>
-          <w:lang w:val="it-IT"/>
-        </w:rPr>
-        <w:t xml:space="preserve"> Se vuoi nel prossimo passo posso aggiungere</w:t>
-      </w:r>
-    </w:p>
-    <w:p>
-      <w:pPr>
-        <w:rPr>
-          <w:color w:val="FF0000"/>
-          <w:lang w:val="it-IT"/>
-        </w:rPr>
-      </w:pPr>
-      <w:r>
-        <w:rPr>
-          <w:color w:val="FF0000"/>
-          <w:lang w:val="it-IT"/>
-        </w:rPr>
-        <w:t xml:space="preserve">Una </w:t>
-      </w:r>
-      <w:r>
-        <w:rPr>
-          <w:b/>
-          <w:bCs/>
-          <w:color w:val="FF0000"/>
-          <w:lang w:val="it-IT"/>
-        </w:rPr>
-        <w:t>funzione molto potente</w:t>
-      </w:r>
-      <w:r>
-        <w:rPr>
-          <w:color w:val="FF0000"/>
-          <w:lang w:val="it-IT"/>
-        </w:rPr>
-        <w:t xml:space="preserve"> che renderebbe il tuo progetto </w:t>
-      </w:r>
-      <w:r>
-        <w:rPr>
-          <w:b/>
-          <w:bCs/>
-          <w:color w:val="FF0000"/>
-          <w:lang w:val="it-IT"/>
-        </w:rPr>
-        <w:t>vendibile alle aziende</w:t>
-      </w:r>
-      <w:r>
-        <w:rPr>
-          <w:color w:val="FF0000"/>
-          <w:lang w:val="it-IT"/>
-        </w:rPr>
-        <w:t>:</w:t>
-      </w:r>
-    </w:p>
-    <w:p>
-      <w:pPr>
-        <w:rPr>
-          <w:b/>
-          <w:bCs/>
-          <w:color w:val="FF0000"/>
-          <w:lang w:val="it-IT"/>
-        </w:rPr>
-      </w:pPr>
-      <w:r>
-        <w:rPr>
-          <w:rFonts w:ascii="Segoe UI Emoji" w:hAnsi="Segoe UI Emoji" w:cs="Segoe UI Emoji"/>
-          <w:b/>
-          <w:bCs/>
-          <w:color w:val="FF0000"/>
-          <w:lang w:val="it-IT"/>
-        </w:rPr>
-        <w:t>⭐</w:t>
-      </w:r>
-      <w:r>
-        <w:rPr>
-          <w:b/>
-          <w:bCs/>
-          <w:color w:val="FF0000"/>
-          <w:lang w:val="it-IT"/>
-        </w:rPr>
-        <w:t xml:space="preserve"> Ricerca nei documenti con AI</w:t>
-      </w:r>
-    </w:p>
-    <w:p>
-      <w:pPr>
-        <w:rPr>
-          <w:color w:val="FF0000"/>
-          <w:lang w:val="it-IT"/>
-        </w:rPr>
-      </w:pPr>
-      <w:r>
-        <w:rPr>
-          <w:color w:val="FF0000"/>
-          <w:lang w:val="it-IT"/>
-        </w:rPr>
-        <w:t>tipo:</w:t>
-      </w:r>
-    </w:p>
-    <w:p>
-      <w:pPr>
-        <w:rPr>
-          <w:color w:val="FF0000"/>
-          <w:lang w:val="it-IT"/>
-        </w:rPr>
-      </w:pPr>
-      <w:r>
-        <w:rPr>
-          <w:color w:val="FF0000"/>
-          <w:lang w:val="it-IT"/>
-        </w:rPr>
-        <w:t>Trova documenti con cognome Rossi</w:t>
-      </w:r>
-    </w:p>
-    <w:p>
-      <w:pPr>
-        <w:rPr>
-          <w:color w:val="FF0000"/>
-          <w:lang w:val="it-IT"/>
-        </w:rPr>
-      </w:pPr>
-      <w:r>
-        <w:rPr>
-          <w:color w:val="FF0000"/>
-          <w:lang w:val="it-IT"/>
-        </w:rPr>
-        <w:t>oppure</w:t>
-      </w:r>
-    </w:p>
-    <w:p>
-      <w:pPr>
-        <w:rPr>
-          <w:color w:val="FF0000"/>
-          <w:lang w:val="it-IT"/>
-        </w:rPr>
-      </w:pPr>
-      <w:r>
-        <w:rPr>
-          <w:color w:val="FF0000"/>
-          <w:lang w:val="it-IT"/>
-        </w:rPr>
-        <w:t>Trova passaporti francesi</w:t>
-      </w:r>
-    </w:p>
-    <w:p>
-      <w:pPr>
-        <w:rPr>
-          <w:color w:val="FF0000"/>
-          <w:lang w:val="it-IT"/>
-        </w:rPr>
-      </w:pPr>
-      <w:r>
-        <w:rPr>
-          <w:color w:val="FF0000"/>
-          <w:lang w:val="it-IT"/>
-        </w:rPr>
-        <w:t>oppure</w:t>
-      </w:r>
-    </w:p>
-    <w:p>
-      <w:pPr>
-        <w:rPr>
-          <w:color w:val="FF0000"/>
-          <w:lang w:val="it-IT"/>
-        </w:rPr>
-      </w:pPr>
-      <w:r>
-        <w:rPr>
-          <w:color w:val="FF0000"/>
-          <w:lang w:val="it-IT"/>
-        </w:rPr>
-        <w:t>Trova documenti con scadenza 2027</w:t>
-      </w:r>
-    </w:p>
-    <w:p>
-      <w:pPr>
-        <w:rPr>
-          <w:color w:val="FF0000"/>
-          <w:lang w:val="it-IT"/>
-        </w:rPr>
-      </w:pPr>
-      <w:r>
-        <w:rPr>
-          <w:color w:val="FF0000"/>
-          <w:lang w:val="it-IT"/>
-        </w:rPr>
-        <w:t xml:space="preserve">Questo è </w:t>
-      </w:r>
-      <w:r>
-        <w:rPr>
-          <w:b/>
-          <w:bCs/>
-          <w:color w:val="FF0000"/>
-          <w:lang w:val="it-IT"/>
-        </w:rPr>
-        <w:t>il tipo di funzione che vendono software da 10-50k €</w:t>
+        <w:t xml:space="preserve">Se vuoi, nel prossimo messaggio ti faccio anche la </w:t>
+      </w:r>
+      <w:r>
+        <w:rPr>
+          <w:b/>
+          <w:bCs/>
+          <w:color w:val="FF0000"/>
+          <w:lang w:val="it-IT"/>
+        </w:rPr>
+        <w:t>funzione AI search completa nel tuo progetto</w:t>
       </w:r>
       <w:r>
         <w:rPr>
@@ -2387,48 +2120,25 @@
           <w:lang w:val="it-IT"/>
         </w:rPr>
       </w:pPr>
-      <w:r>
-        <w:rPr>
-          <w:color w:val="FF0000"/>
-          <w:lang w:val="it-IT"/>
-        </w:rPr>
-        <w:t xml:space="preserve">Se vuoi, nel prossimo messaggio ti faccio anche la </w:t>
-      </w:r>
-      <w:r>
-        <w:rPr>
-          <w:b/>
-          <w:bCs/>
-          <w:color w:val="FF0000"/>
-          <w:lang w:val="it-IT"/>
-        </w:rPr>
-        <w:t xml:space="preserve">funzione AI </w:t>
-      </w:r>
-      <w:proofErr w:type="spellStart"/>
-      <w:r>
-        <w:rPr>
-          <w:b/>
-          <w:bCs/>
-          <w:color w:val="FF0000"/>
-          <w:lang w:val="it-IT"/>
-        </w:rPr>
-        <w:t>search</w:t>
-      </w:r>
-      <w:proofErr w:type="spellEnd"/>
-      <w:r>
-        <w:rPr>
-          <w:b/>
-          <w:bCs/>
-          <w:color w:val="FF0000"/>
-          <w:lang w:val="it-IT"/>
-        </w:rPr>
-        <w:t xml:space="preserve"> completa nel tuo progetto</w:t>
-      </w:r>
-      <w:r>
-        <w:rPr>
-          <w:color w:val="FF0000"/>
-          <w:lang w:val="it-IT"/>
-        </w:rPr>
-        <w:t>.</w:t>
+    </w:p>
+    <w:p>
+      <w:pPr>
+        <w:pStyle w:val="Paragrafoelenco"/>
+        <w:numPr>
+          <w:ilvl w:val="0"/>
+          <w:numId w:val="5"/>
+        </w:numPr>
+        <w:rPr>
+          <w:color w:val="FF0000"/>
+          <w:lang w:val="it-IT"/>
+        </w:rPr>
+      </w:pPr>
+      <w:r>
+        <w:rPr>
+          <w:color w:val="FF0000"/>
+          <w:lang w:val="it-IT"/>
+        </w:rPr>
+        <w:t>RESETTARE FILTRI.</w:t>
       </w:r>
     </w:p>
     <w:p>
@@ -4813,6 +4523,7 @@
   <w:style w:type="character" w:default="1" w:styleId="Carpredefinitoparagrafo">
     <w:name w:val="Default Paragraph Font"/>
     <w:uiPriority w:val="1"/>
+    <w:semiHidden/>
     <w:unhideWhenUsed/>
   </w:style>
   <w:style w:type="table" w:default="1" w:styleId="Tabellanormale">

</xml_diff>